<commit_message>
Miles: kajian pengetahuan KWS - DSP
</commit_message>
<xml_diff>
--- a/00_Report/02_KebutuhanMatkul/Logbook_KP.docx
+++ b/00_Report/02_KebutuhanMatkul/Logbook_KP.docx
@@ -2961,6 +2961,7 @@
           </w:tcPr>
           <w:p>
             <w:pPr>
+              <w:jc w:val="both"/>
               <w:rPr>
                 <w:rFonts w:ascii="Times New Roman" w:hAnsi="Times New Roman" w:cs="Times New Roman"/>
               </w:rPr>
@@ -2990,25 +2991,7 @@
               <w:rPr>
                 <w:rFonts w:ascii="Times New Roman" w:hAnsi="Times New Roman" w:cs="Times New Roman"/>
               </w:rPr>
-              <w:t xml:space="preserve">Selasa, </w:t>
-            </w:r>
-            <w:r>
-              <w:rPr>
-                <w:rFonts w:ascii="Times New Roman" w:hAnsi="Times New Roman" w:cs="Times New Roman"/>
-              </w:rPr>
-              <w:t>2</w:t>
-            </w:r>
-            <w:r>
-              <w:rPr>
-                <w:rFonts w:ascii="Times New Roman" w:hAnsi="Times New Roman" w:cs="Times New Roman"/>
-              </w:rPr>
-              <w:t>3</w:t>
-            </w:r>
-            <w:r>
-              <w:rPr>
-                <w:rFonts w:ascii="Times New Roman" w:hAnsi="Times New Roman" w:cs="Times New Roman"/>
-              </w:rPr>
-              <w:t xml:space="preserve"> Juni 2026</w:t>
+              <w:t>Selasa, 23 Juni 2026</w:t>
             </w:r>
           </w:p>
         </w:tc>
@@ -3018,6 +3001,7 @@
           </w:tcPr>
           <w:p>
             <w:pPr>
+              <w:jc w:val="both"/>
               <w:rPr>
                 <w:rFonts w:ascii="Times New Roman" w:hAnsi="Times New Roman" w:cs="Times New Roman"/>
               </w:rPr>
@@ -3047,25 +3031,7 @@
               <w:rPr>
                 <w:rFonts w:ascii="Times New Roman" w:hAnsi="Times New Roman" w:cs="Times New Roman"/>
               </w:rPr>
-              <w:t xml:space="preserve">Rabu, </w:t>
-            </w:r>
-            <w:r>
-              <w:rPr>
-                <w:rFonts w:ascii="Times New Roman" w:hAnsi="Times New Roman" w:cs="Times New Roman"/>
-              </w:rPr>
-              <w:t>2</w:t>
-            </w:r>
-            <w:r>
-              <w:rPr>
-                <w:rFonts w:ascii="Times New Roman" w:hAnsi="Times New Roman" w:cs="Times New Roman"/>
-              </w:rPr>
-              <w:t>4</w:t>
-            </w:r>
-            <w:r>
-              <w:rPr>
-                <w:rFonts w:ascii="Times New Roman" w:hAnsi="Times New Roman" w:cs="Times New Roman"/>
-              </w:rPr>
-              <w:t xml:space="preserve"> Juni 2026</w:t>
+              <w:t>Rabu, 24 Juni 2026</w:t>
             </w:r>
           </w:p>
         </w:tc>
@@ -3075,6 +3041,7 @@
           </w:tcPr>
           <w:p>
             <w:pPr>
+              <w:jc w:val="both"/>
               <w:rPr>
                 <w:rFonts w:ascii="Times New Roman" w:hAnsi="Times New Roman" w:cs="Times New Roman"/>
               </w:rPr>
@@ -3104,25 +3071,7 @@
               <w:rPr>
                 <w:rFonts w:ascii="Times New Roman" w:hAnsi="Times New Roman" w:cs="Times New Roman"/>
               </w:rPr>
-              <w:t xml:space="preserve">Kamis, </w:t>
-            </w:r>
-            <w:r>
-              <w:rPr>
-                <w:rFonts w:ascii="Times New Roman" w:hAnsi="Times New Roman" w:cs="Times New Roman"/>
-              </w:rPr>
-              <w:t>2</w:t>
-            </w:r>
-            <w:r>
-              <w:rPr>
-                <w:rFonts w:ascii="Times New Roman" w:hAnsi="Times New Roman" w:cs="Times New Roman"/>
-              </w:rPr>
-              <w:t>5</w:t>
-            </w:r>
-            <w:r>
-              <w:rPr>
-                <w:rFonts w:ascii="Times New Roman" w:hAnsi="Times New Roman" w:cs="Times New Roman"/>
-              </w:rPr>
-              <w:t xml:space="preserve"> Juni 2026</w:t>
+              <w:t>Kamis, 25 Juni 2026</w:t>
             </w:r>
           </w:p>
         </w:tc>
@@ -3132,6 +3081,7 @@
           </w:tcPr>
           <w:p>
             <w:pPr>
+              <w:jc w:val="both"/>
               <w:rPr>
                 <w:rFonts w:ascii="Times New Roman" w:hAnsi="Times New Roman" w:cs="Times New Roman"/>
               </w:rPr>
@@ -3161,25 +3111,7 @@
               <w:rPr>
                 <w:rFonts w:ascii="Times New Roman" w:hAnsi="Times New Roman" w:cs="Times New Roman"/>
               </w:rPr>
-              <w:t xml:space="preserve">Jumat, </w:t>
-            </w:r>
-            <w:r>
-              <w:rPr>
-                <w:rFonts w:ascii="Times New Roman" w:hAnsi="Times New Roman" w:cs="Times New Roman"/>
-              </w:rPr>
-              <w:t>2</w:t>
-            </w:r>
-            <w:r>
-              <w:rPr>
-                <w:rFonts w:ascii="Times New Roman" w:hAnsi="Times New Roman" w:cs="Times New Roman"/>
-              </w:rPr>
-              <w:t>6</w:t>
-            </w:r>
-            <w:r>
-              <w:rPr>
-                <w:rFonts w:ascii="Times New Roman" w:hAnsi="Times New Roman" w:cs="Times New Roman"/>
-              </w:rPr>
-              <w:t xml:space="preserve"> Juni 2026</w:t>
+              <w:t>Jumat, 26 Juni 2026</w:t>
             </w:r>
           </w:p>
         </w:tc>
@@ -3189,27 +3121,16 @@
           </w:tcPr>
           <w:p>
             <w:pPr>
-              <w:rPr>
-                <w:rFonts w:ascii="Times New Roman" w:hAnsi="Times New Roman" w:cs="Times New Roman"/>
-              </w:rPr>
-            </w:pPr>
-            <w:r>
-              <w:rPr>
-                <w:rFonts w:ascii="Times New Roman" w:hAnsi="Times New Roman" w:cs="Times New Roman"/>
-              </w:rPr>
-              <w:t xml:space="preserve">Mulai mengembangkan firmware akuisisi audio pada STM32U5A9J-DK, mempelajari konsep DMA, serta menyusun Gantt chart dan WBS proyek untuk </w:t>
-            </w:r>
-            <w:r>
-              <w:rPr>
-                <w:rFonts w:ascii="Times New Roman" w:hAnsi="Times New Roman" w:cs="Times New Roman"/>
-              </w:rPr>
-              <w:t>7</w:t>
-            </w:r>
-            <w:r>
-              <w:rPr>
-                <w:rFonts w:ascii="Times New Roman" w:hAnsi="Times New Roman" w:cs="Times New Roman"/>
-              </w:rPr>
-              <w:t xml:space="preserve"> minggu ke depan</w:t>
+              <w:jc w:val="both"/>
+              <w:rPr>
+                <w:rFonts w:ascii="Times New Roman" w:hAnsi="Times New Roman" w:cs="Times New Roman"/>
+              </w:rPr>
+            </w:pPr>
+            <w:r>
+              <w:rPr>
+                <w:rFonts w:ascii="Times New Roman" w:hAnsi="Times New Roman" w:cs="Times New Roman"/>
+              </w:rPr>
+              <w:t>Mulai mengembangkan firmware akuisisi audio pada STM32U5A9J-DK, mempelajari konsep DMA, serta menyusun Gantt chart dan WBS proyek untuk 7 minggu ke depan</w:t>
             </w:r>
           </w:p>
         </w:tc>
@@ -3232,13 +3153,7 @@
               <w:rPr>
                 <w:rFonts w:ascii="Times New Roman" w:hAnsi="Times New Roman" w:cs="Times New Roman"/>
               </w:rPr>
-              <w:t>Minggu-0</w:t>
-            </w:r>
-            <w:r>
-              <w:rPr>
-                <w:rFonts w:ascii="Times New Roman" w:hAnsi="Times New Roman" w:cs="Times New Roman"/>
-              </w:rPr>
-              <w:t>2</w:t>
+              <w:t>Minggu-02</w:t>
             </w:r>
           </w:p>
         </w:tc>
@@ -3259,19 +3174,7 @@
               <w:rPr>
                 <w:rFonts w:ascii="Times New Roman" w:hAnsi="Times New Roman" w:cs="Times New Roman"/>
               </w:rPr>
-              <w:t>Senin, 2</w:t>
-            </w:r>
-            <w:r>
-              <w:rPr>
-                <w:rFonts w:ascii="Times New Roman" w:hAnsi="Times New Roman" w:cs="Times New Roman"/>
-              </w:rPr>
-              <w:t>9</w:t>
-            </w:r>
-            <w:r>
-              <w:rPr>
-                <w:rFonts w:ascii="Times New Roman" w:hAnsi="Times New Roman" w:cs="Times New Roman"/>
-              </w:rPr>
-              <w:t xml:space="preserve"> Juni 2026</w:t>
+              <w:t>Senin, 29 Juni 2026</w:t>
             </w:r>
           </w:p>
         </w:tc>
@@ -3281,6 +3184,7 @@
           </w:tcPr>
           <w:p>
             <w:pPr>
+              <w:jc w:val="both"/>
               <w:rPr>
                 <w:rFonts w:ascii="Times New Roman" w:hAnsi="Times New Roman" w:cs="Times New Roman"/>
               </w:rPr>
@@ -3310,19 +3214,7 @@
               <w:rPr>
                 <w:rFonts w:ascii="Times New Roman" w:hAnsi="Times New Roman" w:cs="Times New Roman"/>
               </w:rPr>
-              <w:t>Selasa, 3</w:t>
-            </w:r>
-            <w:r>
-              <w:rPr>
-                <w:rFonts w:ascii="Times New Roman" w:hAnsi="Times New Roman" w:cs="Times New Roman"/>
-              </w:rPr>
-              <w:t>0</w:t>
-            </w:r>
-            <w:r>
-              <w:rPr>
-                <w:rFonts w:ascii="Times New Roman" w:hAnsi="Times New Roman" w:cs="Times New Roman"/>
-              </w:rPr>
-              <w:t xml:space="preserve"> Juni 2026</w:t>
+              <w:t>Selasa, 30 Juni 2026</w:t>
             </w:r>
           </w:p>
         </w:tc>
@@ -3332,6 +3224,7 @@
           </w:tcPr>
           <w:p>
             <w:pPr>
+              <w:jc w:val="both"/>
               <w:rPr>
                 <w:rFonts w:ascii="Times New Roman" w:hAnsi="Times New Roman" w:cs="Times New Roman"/>
               </w:rPr>
@@ -3361,31 +3254,7 @@
               <w:rPr>
                 <w:rFonts w:ascii="Times New Roman" w:hAnsi="Times New Roman" w:cs="Times New Roman"/>
               </w:rPr>
-              <w:t xml:space="preserve">Rabu, </w:t>
-            </w:r>
-            <w:r>
-              <w:rPr>
-                <w:rFonts w:ascii="Times New Roman" w:hAnsi="Times New Roman" w:cs="Times New Roman"/>
-              </w:rPr>
-              <w:t>01</w:t>
-            </w:r>
-            <w:r>
-              <w:rPr>
-                <w:rFonts w:ascii="Times New Roman" w:hAnsi="Times New Roman" w:cs="Times New Roman"/>
-              </w:rPr>
-              <w:t xml:space="preserve"> </w:t>
-            </w:r>
-            <w:r>
-              <w:rPr>
-                <w:rFonts w:ascii="Times New Roman" w:hAnsi="Times New Roman" w:cs="Times New Roman"/>
-              </w:rPr>
-              <w:t>Juli</w:t>
-            </w:r>
-            <w:r>
-              <w:rPr>
-                <w:rFonts w:ascii="Times New Roman" w:hAnsi="Times New Roman" w:cs="Times New Roman"/>
-              </w:rPr>
-              <w:t xml:space="preserve"> 2026</w:t>
+              <w:t>Rabu, 01 Juli 2026</w:t>
             </w:r>
           </w:p>
         </w:tc>
@@ -3395,6 +3264,7 @@
           </w:tcPr>
           <w:p>
             <w:pPr>
+              <w:jc w:val="both"/>
               <w:rPr>
                 <w:rFonts w:ascii="Times New Roman" w:hAnsi="Times New Roman" w:cs="Times New Roman"/>
               </w:rPr>
@@ -3424,19 +3294,7 @@
               <w:rPr>
                 <w:rFonts w:ascii="Times New Roman" w:hAnsi="Times New Roman" w:cs="Times New Roman"/>
               </w:rPr>
-              <w:t xml:space="preserve">Kamis, </w:t>
-            </w:r>
-            <w:r>
-              <w:rPr>
-                <w:rFonts w:ascii="Times New Roman" w:hAnsi="Times New Roman" w:cs="Times New Roman"/>
-              </w:rPr>
-              <w:t>02</w:t>
-            </w:r>
-            <w:r>
-              <w:rPr>
-                <w:rFonts w:ascii="Times New Roman" w:hAnsi="Times New Roman" w:cs="Times New Roman"/>
-              </w:rPr>
-              <w:t xml:space="preserve"> Juli 2026</w:t>
+              <w:t>Kamis, 02 Juli 2026</w:t>
             </w:r>
           </w:p>
         </w:tc>
@@ -3446,6 +3304,7 @@
           </w:tcPr>
           <w:p>
             <w:pPr>
+              <w:jc w:val="both"/>
               <w:rPr>
                 <w:rFonts w:ascii="Times New Roman" w:hAnsi="Times New Roman" w:cs="Times New Roman"/>
               </w:rPr>
@@ -3475,19 +3334,7 @@
               <w:rPr>
                 <w:rFonts w:ascii="Times New Roman" w:hAnsi="Times New Roman" w:cs="Times New Roman"/>
               </w:rPr>
-              <w:t xml:space="preserve">Jumat, </w:t>
-            </w:r>
-            <w:r>
-              <w:rPr>
-                <w:rFonts w:ascii="Times New Roman" w:hAnsi="Times New Roman" w:cs="Times New Roman"/>
-              </w:rPr>
-              <w:t>03</w:t>
-            </w:r>
-            <w:r>
-              <w:rPr>
-                <w:rFonts w:ascii="Times New Roman" w:hAnsi="Times New Roman" w:cs="Times New Roman"/>
-              </w:rPr>
-              <w:t xml:space="preserve"> Juli 2026</w:t>
+              <w:t>Jumat, 03 Juli 2026</w:t>
             </w:r>
           </w:p>
         </w:tc>
@@ -3497,21 +3344,16 @@
           </w:tcPr>
           <w:p>
             <w:pPr>
-              <w:rPr>
-                <w:rFonts w:ascii="Times New Roman" w:hAnsi="Times New Roman" w:cs="Times New Roman"/>
-              </w:rPr>
-            </w:pPr>
-            <w:r>
-              <w:rPr>
-                <w:rFonts w:ascii="Times New Roman" w:hAnsi="Times New Roman" w:cs="Times New Roman"/>
-              </w:rPr>
-              <w:t>Menyusun format laporan dan logbook, menyusun dokumen kajian pengetahuan, serta membuat weekly report</w:t>
-            </w:r>
-            <w:r>
-              <w:rPr>
-                <w:rFonts w:ascii="Times New Roman" w:hAnsi="Times New Roman" w:cs="Times New Roman"/>
-              </w:rPr>
-              <w:t>.</w:t>
+              <w:jc w:val="both"/>
+              <w:rPr>
+                <w:rFonts w:ascii="Times New Roman" w:hAnsi="Times New Roman" w:cs="Times New Roman"/>
+              </w:rPr>
+            </w:pPr>
+            <w:r>
+              <w:rPr>
+                <w:rFonts w:ascii="Times New Roman" w:hAnsi="Times New Roman" w:cs="Times New Roman"/>
+              </w:rPr>
+              <w:t>Menyusun format laporan dan logbook, menyusun dokumen kajian pengetahuan, serta membuat weekly report.</w:t>
             </w:r>
           </w:p>
         </w:tc>
@@ -3534,13 +3376,7 @@
               <w:rPr>
                 <w:rFonts w:ascii="Times New Roman" w:hAnsi="Times New Roman" w:cs="Times New Roman"/>
               </w:rPr>
-              <w:t>Minggu-0</w:t>
-            </w:r>
-            <w:r>
-              <w:rPr>
-                <w:rFonts w:ascii="Times New Roman" w:hAnsi="Times New Roman" w:cs="Times New Roman"/>
-              </w:rPr>
-              <w:t>3</w:t>
+              <w:t>Minggu-03</w:t>
             </w:r>
           </w:p>
         </w:tc>
@@ -3561,19 +3397,7 @@
               <w:rPr>
                 <w:rFonts w:ascii="Times New Roman" w:hAnsi="Times New Roman" w:cs="Times New Roman"/>
               </w:rPr>
-              <w:t xml:space="preserve">Senin, </w:t>
-            </w:r>
-            <w:r>
-              <w:rPr>
-                <w:rFonts w:ascii="Times New Roman" w:hAnsi="Times New Roman" w:cs="Times New Roman"/>
-              </w:rPr>
-              <w:t>06</w:t>
-            </w:r>
-            <w:r>
-              <w:rPr>
-                <w:rFonts w:ascii="Times New Roman" w:hAnsi="Times New Roman" w:cs="Times New Roman"/>
-              </w:rPr>
-              <w:t xml:space="preserve"> Juli 2026</w:t>
+              <w:t>Senin, 06 Juli 2026</w:t>
             </w:r>
           </w:p>
         </w:tc>
@@ -3583,10 +3407,17 @@
           </w:tcPr>
           <w:p>
             <w:pPr>
-              <w:rPr>
-                <w:rFonts w:ascii="Times New Roman" w:hAnsi="Times New Roman" w:cs="Times New Roman"/>
-              </w:rPr>
-            </w:pPr>
+              <w:jc w:val="both"/>
+              <w:rPr>
+                <w:rFonts w:ascii="Times New Roman" w:hAnsi="Times New Roman" w:cs="Times New Roman"/>
+              </w:rPr>
+            </w:pPr>
+            <w:r>
+              <w:rPr>
+                <w:rFonts w:ascii="Times New Roman" w:hAnsi="Times New Roman" w:cs="Times New Roman"/>
+              </w:rPr>
+              <w:t>Membuat weekly report, melakukan studi dan reverse engineer KWS Egde Impulse, Verifikasi penggunaan DSP M33 Cortex</w:t>
+            </w:r>
           </w:p>
         </w:tc>
       </w:tr>
@@ -3606,19 +3437,7 @@
               <w:rPr>
                 <w:rFonts w:ascii="Times New Roman" w:hAnsi="Times New Roman" w:cs="Times New Roman"/>
               </w:rPr>
-              <w:t xml:space="preserve">Selasa, </w:t>
-            </w:r>
-            <w:r>
-              <w:rPr>
-                <w:rFonts w:ascii="Times New Roman" w:hAnsi="Times New Roman" w:cs="Times New Roman"/>
-              </w:rPr>
-              <w:t>07</w:t>
-            </w:r>
-            <w:r>
-              <w:rPr>
-                <w:rFonts w:ascii="Times New Roman" w:hAnsi="Times New Roman" w:cs="Times New Roman"/>
-              </w:rPr>
-              <w:t xml:space="preserve"> Juli 2026</w:t>
+              <w:t>Selasa, 07 Juli 2026</w:t>
             </w:r>
           </w:p>
         </w:tc>
@@ -3651,19 +3470,7 @@
               <w:rPr>
                 <w:rFonts w:ascii="Times New Roman" w:hAnsi="Times New Roman" w:cs="Times New Roman"/>
               </w:rPr>
-              <w:t xml:space="preserve">Rabu, </w:t>
-            </w:r>
-            <w:r>
-              <w:rPr>
-                <w:rFonts w:ascii="Times New Roman" w:hAnsi="Times New Roman" w:cs="Times New Roman"/>
-              </w:rPr>
-              <w:t>08</w:t>
-            </w:r>
-            <w:r>
-              <w:rPr>
-                <w:rFonts w:ascii="Times New Roman" w:hAnsi="Times New Roman" w:cs="Times New Roman"/>
-              </w:rPr>
-              <w:t xml:space="preserve"> Juli 2026</w:t>
+              <w:t>Rabu, 08 Juli 2026</w:t>
             </w:r>
           </w:p>
         </w:tc>
@@ -3696,19 +3503,7 @@
               <w:rPr>
                 <w:rFonts w:ascii="Times New Roman" w:hAnsi="Times New Roman" w:cs="Times New Roman"/>
               </w:rPr>
-              <w:t xml:space="preserve">Kamis, </w:t>
-            </w:r>
-            <w:r>
-              <w:rPr>
-                <w:rFonts w:ascii="Times New Roman" w:hAnsi="Times New Roman" w:cs="Times New Roman"/>
-              </w:rPr>
-              <w:t>09</w:t>
-            </w:r>
-            <w:r>
-              <w:rPr>
-                <w:rFonts w:ascii="Times New Roman" w:hAnsi="Times New Roman" w:cs="Times New Roman"/>
-              </w:rPr>
-              <w:t xml:space="preserve"> Juli 2026</w:t>
+              <w:t>Kamis, 09 Juli 2026</w:t>
             </w:r>
           </w:p>
         </w:tc>
@@ -3741,19 +3536,7 @@
               <w:rPr>
                 <w:rFonts w:ascii="Times New Roman" w:hAnsi="Times New Roman" w:cs="Times New Roman"/>
               </w:rPr>
-              <w:t xml:space="preserve">Jumat, </w:t>
-            </w:r>
-            <w:r>
-              <w:rPr>
-                <w:rFonts w:ascii="Times New Roman" w:hAnsi="Times New Roman" w:cs="Times New Roman"/>
-              </w:rPr>
-              <w:t>10</w:t>
-            </w:r>
-            <w:r>
-              <w:rPr>
-                <w:rFonts w:ascii="Times New Roman" w:hAnsi="Times New Roman" w:cs="Times New Roman"/>
-              </w:rPr>
-              <w:t xml:space="preserve"> Juli 2026</w:t>
+              <w:t>Jumat, 10 Juli 2026</w:t>
             </w:r>
           </w:p>
         </w:tc>
@@ -3788,13 +3571,7 @@
               <w:rPr>
                 <w:rFonts w:ascii="Times New Roman" w:hAnsi="Times New Roman" w:cs="Times New Roman"/>
               </w:rPr>
-              <w:t>Minggu-0</w:t>
-            </w:r>
-            <w:r>
-              <w:rPr>
-                <w:rFonts w:ascii="Times New Roman" w:hAnsi="Times New Roman" w:cs="Times New Roman"/>
-              </w:rPr>
-              <w:t>4</w:t>
+              <w:t>Minggu-04</w:t>
             </w:r>
           </w:p>
         </w:tc>
@@ -3815,19 +3592,7 @@
               <w:rPr>
                 <w:rFonts w:ascii="Times New Roman" w:hAnsi="Times New Roman" w:cs="Times New Roman"/>
               </w:rPr>
-              <w:t xml:space="preserve">Senin, </w:t>
-            </w:r>
-            <w:r>
-              <w:rPr>
-                <w:rFonts w:ascii="Times New Roman" w:hAnsi="Times New Roman" w:cs="Times New Roman"/>
-              </w:rPr>
-              <w:t>13</w:t>
-            </w:r>
-            <w:r>
-              <w:rPr>
-                <w:rFonts w:ascii="Times New Roman" w:hAnsi="Times New Roman" w:cs="Times New Roman"/>
-              </w:rPr>
-              <w:t xml:space="preserve"> Juli 2026</w:t>
+              <w:t>Senin, 13 Juli 2026</w:t>
             </w:r>
           </w:p>
         </w:tc>
@@ -3860,19 +3625,7 @@
               <w:rPr>
                 <w:rFonts w:ascii="Times New Roman" w:hAnsi="Times New Roman" w:cs="Times New Roman"/>
               </w:rPr>
-              <w:t xml:space="preserve">Selasa, </w:t>
-            </w:r>
-            <w:r>
-              <w:rPr>
-                <w:rFonts w:ascii="Times New Roman" w:hAnsi="Times New Roman" w:cs="Times New Roman"/>
-              </w:rPr>
-              <w:t>14</w:t>
-            </w:r>
-            <w:r>
-              <w:rPr>
-                <w:rFonts w:ascii="Times New Roman" w:hAnsi="Times New Roman" w:cs="Times New Roman"/>
-              </w:rPr>
-              <w:t xml:space="preserve"> Juli 2026</w:t>
+              <w:t>Selasa, 14 Juli 2026</w:t>
             </w:r>
           </w:p>
         </w:tc>
@@ -3905,19 +3658,7 @@
               <w:rPr>
                 <w:rFonts w:ascii="Times New Roman" w:hAnsi="Times New Roman" w:cs="Times New Roman"/>
               </w:rPr>
-              <w:t xml:space="preserve">Rabu, </w:t>
-            </w:r>
-            <w:r>
-              <w:rPr>
-                <w:rFonts w:ascii="Times New Roman" w:hAnsi="Times New Roman" w:cs="Times New Roman"/>
-              </w:rPr>
-              <w:t>15</w:t>
-            </w:r>
-            <w:r>
-              <w:rPr>
-                <w:rFonts w:ascii="Times New Roman" w:hAnsi="Times New Roman" w:cs="Times New Roman"/>
-              </w:rPr>
-              <w:t xml:space="preserve"> Juli 2026</w:t>
+              <w:t>Rabu, 15 Juli 2026</w:t>
             </w:r>
           </w:p>
         </w:tc>
@@ -3950,19 +3691,7 @@
               <w:rPr>
                 <w:rFonts w:ascii="Times New Roman" w:hAnsi="Times New Roman" w:cs="Times New Roman"/>
               </w:rPr>
-              <w:t xml:space="preserve">Kamis, </w:t>
-            </w:r>
-            <w:r>
-              <w:rPr>
-                <w:rFonts w:ascii="Times New Roman" w:hAnsi="Times New Roman" w:cs="Times New Roman"/>
-              </w:rPr>
-              <w:t>16</w:t>
-            </w:r>
-            <w:r>
-              <w:rPr>
-                <w:rFonts w:ascii="Times New Roman" w:hAnsi="Times New Roman" w:cs="Times New Roman"/>
-              </w:rPr>
-              <w:t xml:space="preserve"> Juli 2026</w:t>
+              <w:t>Kamis, 16 Juli 2026</w:t>
             </w:r>
           </w:p>
         </w:tc>
@@ -3995,19 +3724,7 @@
               <w:rPr>
                 <w:rFonts w:ascii="Times New Roman" w:hAnsi="Times New Roman" w:cs="Times New Roman"/>
               </w:rPr>
-              <w:t xml:space="preserve">Jumat, </w:t>
-            </w:r>
-            <w:r>
-              <w:rPr>
-                <w:rFonts w:ascii="Times New Roman" w:hAnsi="Times New Roman" w:cs="Times New Roman"/>
-              </w:rPr>
-              <w:t>17</w:t>
-            </w:r>
-            <w:r>
-              <w:rPr>
-                <w:rFonts w:ascii="Times New Roman" w:hAnsi="Times New Roman" w:cs="Times New Roman"/>
-              </w:rPr>
-              <w:t xml:space="preserve"> Juli 2026</w:t>
+              <w:t>Jumat, 17 Juli 2026</w:t>
             </w:r>
           </w:p>
         </w:tc>
@@ -4042,13 +3759,7 @@
               <w:rPr>
                 <w:rFonts w:ascii="Times New Roman" w:hAnsi="Times New Roman" w:cs="Times New Roman"/>
               </w:rPr>
-              <w:t>Minggu-0</w:t>
-            </w:r>
-            <w:r>
-              <w:rPr>
-                <w:rFonts w:ascii="Times New Roman" w:hAnsi="Times New Roman" w:cs="Times New Roman"/>
-              </w:rPr>
-              <w:t>5</w:t>
+              <w:t>Minggu-05</w:t>
             </w:r>
           </w:p>
         </w:tc>
@@ -4069,19 +3780,7 @@
               <w:rPr>
                 <w:rFonts w:ascii="Times New Roman" w:hAnsi="Times New Roman" w:cs="Times New Roman"/>
               </w:rPr>
-              <w:t>Senin, 2</w:t>
-            </w:r>
-            <w:r>
-              <w:rPr>
-                <w:rFonts w:ascii="Times New Roman" w:hAnsi="Times New Roman" w:cs="Times New Roman"/>
-              </w:rPr>
-              <w:t>0</w:t>
-            </w:r>
-            <w:r>
-              <w:rPr>
-                <w:rFonts w:ascii="Times New Roman" w:hAnsi="Times New Roman" w:cs="Times New Roman"/>
-              </w:rPr>
-              <w:t xml:space="preserve"> Juli 2026</w:t>
+              <w:t>Senin, 20 Juli 2026</w:t>
             </w:r>
           </w:p>
         </w:tc>
@@ -4114,19 +3813,7 @@
               <w:rPr>
                 <w:rFonts w:ascii="Times New Roman" w:hAnsi="Times New Roman" w:cs="Times New Roman"/>
               </w:rPr>
-              <w:t>Selasa, 2</w:t>
-            </w:r>
-            <w:r>
-              <w:rPr>
-                <w:rFonts w:ascii="Times New Roman" w:hAnsi="Times New Roman" w:cs="Times New Roman"/>
-              </w:rPr>
-              <w:t>1</w:t>
-            </w:r>
-            <w:r>
-              <w:rPr>
-                <w:rFonts w:ascii="Times New Roman" w:hAnsi="Times New Roman" w:cs="Times New Roman"/>
-              </w:rPr>
-              <w:t xml:space="preserve"> Juli 2026</w:t>
+              <w:t>Selasa, 21 Juli 2026</w:t>
             </w:r>
           </w:p>
         </w:tc>
@@ -4159,19 +3846,7 @@
               <w:rPr>
                 <w:rFonts w:ascii="Times New Roman" w:hAnsi="Times New Roman" w:cs="Times New Roman"/>
               </w:rPr>
-              <w:t>Rabu, 2</w:t>
-            </w:r>
-            <w:r>
-              <w:rPr>
-                <w:rFonts w:ascii="Times New Roman" w:hAnsi="Times New Roman" w:cs="Times New Roman"/>
-              </w:rPr>
-              <w:t>2</w:t>
-            </w:r>
-            <w:r>
-              <w:rPr>
-                <w:rFonts w:ascii="Times New Roman" w:hAnsi="Times New Roman" w:cs="Times New Roman"/>
-              </w:rPr>
-              <w:t xml:space="preserve"> Juli 2026</w:t>
+              <w:t>Rabu, 22 Juli 2026</w:t>
             </w:r>
           </w:p>
         </w:tc>
@@ -4204,19 +3879,8 @@
               <w:rPr>
                 <w:rFonts w:ascii="Times New Roman" w:hAnsi="Times New Roman" w:cs="Times New Roman"/>
               </w:rPr>
-              <w:t>Kamis, 2</w:t>
-            </w:r>
-            <w:r>
-              <w:rPr>
-                <w:rFonts w:ascii="Times New Roman" w:hAnsi="Times New Roman" w:cs="Times New Roman"/>
-              </w:rPr>
-              <w:t>3</w:t>
-            </w:r>
-            <w:r>
-              <w:rPr>
-                <w:rFonts w:ascii="Times New Roman" w:hAnsi="Times New Roman" w:cs="Times New Roman"/>
-              </w:rPr>
-              <w:t xml:space="preserve"> Juli 2026</w:t>
+              <w:lastRenderedPageBreak/>
+              <w:t>Kamis, 23 Juli 2026</w:t>
             </w:r>
           </w:p>
         </w:tc>
@@ -4249,20 +3913,7 @@
               <w:rPr>
                 <w:rFonts w:ascii="Times New Roman" w:hAnsi="Times New Roman" w:cs="Times New Roman"/>
               </w:rPr>
-              <w:lastRenderedPageBreak/>
-              <w:t>Jumat, 2</w:t>
-            </w:r>
-            <w:r>
-              <w:rPr>
-                <w:rFonts w:ascii="Times New Roman" w:hAnsi="Times New Roman" w:cs="Times New Roman"/>
-              </w:rPr>
-              <w:t>4</w:t>
-            </w:r>
-            <w:r>
-              <w:rPr>
-                <w:rFonts w:ascii="Times New Roman" w:hAnsi="Times New Roman" w:cs="Times New Roman"/>
-              </w:rPr>
-              <w:t xml:space="preserve"> Juni 2026</w:t>
+              <w:t>Jumat, 24 Juni 2026</w:t>
             </w:r>
           </w:p>
         </w:tc>
@@ -4297,13 +3948,7 @@
               <w:rPr>
                 <w:rFonts w:ascii="Times New Roman" w:hAnsi="Times New Roman" w:cs="Times New Roman"/>
               </w:rPr>
-              <w:t>Minggu-0</w:t>
-            </w:r>
-            <w:r>
-              <w:rPr>
-                <w:rFonts w:ascii="Times New Roman" w:hAnsi="Times New Roman" w:cs="Times New Roman"/>
-              </w:rPr>
-              <w:t>6</w:t>
+              <w:t>Minggu-06</w:t>
             </w:r>
           </w:p>
         </w:tc>
@@ -4324,19 +3969,7 @@
               <w:rPr>
                 <w:rFonts w:ascii="Times New Roman" w:hAnsi="Times New Roman" w:cs="Times New Roman"/>
               </w:rPr>
-              <w:t>Senin, 2</w:t>
-            </w:r>
-            <w:r>
-              <w:rPr>
-                <w:rFonts w:ascii="Times New Roman" w:hAnsi="Times New Roman" w:cs="Times New Roman"/>
-              </w:rPr>
-              <w:t>7</w:t>
-            </w:r>
-            <w:r>
-              <w:rPr>
-                <w:rFonts w:ascii="Times New Roman" w:hAnsi="Times New Roman" w:cs="Times New Roman"/>
-              </w:rPr>
-              <w:t xml:space="preserve"> Juli 2026</w:t>
+              <w:t>Senin, 27 Juli 2026</w:t>
             </w:r>
           </w:p>
         </w:tc>
@@ -4369,19 +4002,7 @@
               <w:rPr>
                 <w:rFonts w:ascii="Times New Roman" w:hAnsi="Times New Roman" w:cs="Times New Roman"/>
               </w:rPr>
-              <w:t>Selasa, 2</w:t>
-            </w:r>
-            <w:r>
-              <w:rPr>
-                <w:rFonts w:ascii="Times New Roman" w:hAnsi="Times New Roman" w:cs="Times New Roman"/>
-              </w:rPr>
-              <w:t>8</w:t>
-            </w:r>
-            <w:r>
-              <w:rPr>
-                <w:rFonts w:ascii="Times New Roman" w:hAnsi="Times New Roman" w:cs="Times New Roman"/>
-              </w:rPr>
-              <w:t xml:space="preserve"> Juli 2026</w:t>
+              <w:t>Selasa, 28 Juli 2026</w:t>
             </w:r>
           </w:p>
         </w:tc>
@@ -4414,19 +4035,7 @@
               <w:rPr>
                 <w:rFonts w:ascii="Times New Roman" w:hAnsi="Times New Roman" w:cs="Times New Roman"/>
               </w:rPr>
-              <w:t>Rabu, 2</w:t>
-            </w:r>
-            <w:r>
-              <w:rPr>
-                <w:rFonts w:ascii="Times New Roman" w:hAnsi="Times New Roman" w:cs="Times New Roman"/>
-              </w:rPr>
-              <w:t>9</w:t>
-            </w:r>
-            <w:r>
-              <w:rPr>
-                <w:rFonts w:ascii="Times New Roman" w:hAnsi="Times New Roman" w:cs="Times New Roman"/>
-              </w:rPr>
-              <w:t xml:space="preserve"> Juli 2026</w:t>
+              <w:t>Rabu, 29 Juli 2026</w:t>
             </w:r>
           </w:p>
         </w:tc>
@@ -4459,19 +4068,7 @@
               <w:rPr>
                 <w:rFonts w:ascii="Times New Roman" w:hAnsi="Times New Roman" w:cs="Times New Roman"/>
               </w:rPr>
-              <w:t xml:space="preserve">Kamis, </w:t>
-            </w:r>
-            <w:r>
-              <w:rPr>
-                <w:rFonts w:ascii="Times New Roman" w:hAnsi="Times New Roman" w:cs="Times New Roman"/>
-              </w:rPr>
-              <w:t>30</w:t>
-            </w:r>
-            <w:r>
-              <w:rPr>
-                <w:rFonts w:ascii="Times New Roman" w:hAnsi="Times New Roman" w:cs="Times New Roman"/>
-              </w:rPr>
-              <w:t xml:space="preserve"> Juli 2026</w:t>
+              <w:t>Kamis, 30 Juli 2026</w:t>
             </w:r>
           </w:p>
         </w:tc>
@@ -4504,19 +4101,7 @@
               <w:rPr>
                 <w:rFonts w:ascii="Times New Roman" w:hAnsi="Times New Roman" w:cs="Times New Roman"/>
               </w:rPr>
-              <w:t xml:space="preserve">Jumat, </w:t>
-            </w:r>
-            <w:r>
-              <w:rPr>
-                <w:rFonts w:ascii="Times New Roman" w:hAnsi="Times New Roman" w:cs="Times New Roman"/>
-              </w:rPr>
-              <w:t>31</w:t>
-            </w:r>
-            <w:r>
-              <w:rPr>
-                <w:rFonts w:ascii="Times New Roman" w:hAnsi="Times New Roman" w:cs="Times New Roman"/>
-              </w:rPr>
-              <w:t xml:space="preserve"> Juli 2026</w:t>
+              <w:t>Jumat, 31 Juli 2026</w:t>
             </w:r>
           </w:p>
         </w:tc>
@@ -4551,13 +4136,7 @@
               <w:rPr>
                 <w:rFonts w:ascii="Times New Roman" w:hAnsi="Times New Roman" w:cs="Times New Roman"/>
               </w:rPr>
-              <w:t>Minggu-0</w:t>
-            </w:r>
-            <w:r>
-              <w:rPr>
-                <w:rFonts w:ascii="Times New Roman" w:hAnsi="Times New Roman" w:cs="Times New Roman"/>
-              </w:rPr>
-              <w:t>7</w:t>
+              <w:t>Minggu-07</w:t>
             </w:r>
           </w:p>
         </w:tc>
@@ -4578,31 +4157,7 @@
               <w:rPr>
                 <w:rFonts w:ascii="Times New Roman" w:hAnsi="Times New Roman" w:cs="Times New Roman"/>
               </w:rPr>
-              <w:t xml:space="preserve">Senin, </w:t>
-            </w:r>
-            <w:r>
-              <w:rPr>
-                <w:rFonts w:ascii="Times New Roman" w:hAnsi="Times New Roman" w:cs="Times New Roman"/>
-              </w:rPr>
-              <w:t>03</w:t>
-            </w:r>
-            <w:r>
-              <w:rPr>
-                <w:rFonts w:ascii="Times New Roman" w:hAnsi="Times New Roman" w:cs="Times New Roman"/>
-              </w:rPr>
-              <w:t xml:space="preserve"> </w:t>
-            </w:r>
-            <w:r>
-              <w:rPr>
-                <w:rFonts w:ascii="Times New Roman" w:hAnsi="Times New Roman" w:cs="Times New Roman"/>
-              </w:rPr>
-              <w:t>Agustus</w:t>
-            </w:r>
-            <w:r>
-              <w:rPr>
-                <w:rFonts w:ascii="Times New Roman" w:hAnsi="Times New Roman" w:cs="Times New Roman"/>
-              </w:rPr>
-              <w:t xml:space="preserve"> 2026</w:t>
+              <w:t>Senin, 03 Agustus 2026</w:t>
             </w:r>
           </w:p>
         </w:tc>
@@ -4635,19 +4190,7 @@
               <w:rPr>
                 <w:rFonts w:ascii="Times New Roman" w:hAnsi="Times New Roman" w:cs="Times New Roman"/>
               </w:rPr>
-              <w:t xml:space="preserve">Selasa, </w:t>
-            </w:r>
-            <w:r>
-              <w:rPr>
-                <w:rFonts w:ascii="Times New Roman" w:hAnsi="Times New Roman" w:cs="Times New Roman"/>
-              </w:rPr>
-              <w:t>04</w:t>
-            </w:r>
-            <w:r>
-              <w:rPr>
-                <w:rFonts w:ascii="Times New Roman" w:hAnsi="Times New Roman" w:cs="Times New Roman"/>
-              </w:rPr>
-              <w:t xml:space="preserve"> Agustus 2026</w:t>
+              <w:t>Selasa, 04 Agustus 2026</w:t>
             </w:r>
           </w:p>
         </w:tc>
@@ -4680,19 +4223,7 @@
               <w:rPr>
                 <w:rFonts w:ascii="Times New Roman" w:hAnsi="Times New Roman" w:cs="Times New Roman"/>
               </w:rPr>
-              <w:t xml:space="preserve">Rabu, </w:t>
-            </w:r>
-            <w:r>
-              <w:rPr>
-                <w:rFonts w:ascii="Times New Roman" w:hAnsi="Times New Roman" w:cs="Times New Roman"/>
-              </w:rPr>
-              <w:t>05</w:t>
-            </w:r>
-            <w:r>
-              <w:rPr>
-                <w:rFonts w:ascii="Times New Roman" w:hAnsi="Times New Roman" w:cs="Times New Roman"/>
-              </w:rPr>
-              <w:t xml:space="preserve"> Agustus 2026</w:t>
+              <w:t>Rabu, 05 Agustus 2026</w:t>
             </w:r>
           </w:p>
         </w:tc>
@@ -4725,19 +4256,7 @@
               <w:rPr>
                 <w:rFonts w:ascii="Times New Roman" w:hAnsi="Times New Roman" w:cs="Times New Roman"/>
               </w:rPr>
-              <w:t xml:space="preserve">Kamis, </w:t>
-            </w:r>
-            <w:r>
-              <w:rPr>
-                <w:rFonts w:ascii="Times New Roman" w:hAnsi="Times New Roman" w:cs="Times New Roman"/>
-              </w:rPr>
-              <w:t>06</w:t>
-            </w:r>
-            <w:r>
-              <w:rPr>
-                <w:rFonts w:ascii="Times New Roman" w:hAnsi="Times New Roman" w:cs="Times New Roman"/>
-              </w:rPr>
-              <w:t xml:space="preserve"> Agustus 2026</w:t>
+              <w:t>Kamis, 06 Agustus 2026</w:t>
             </w:r>
           </w:p>
         </w:tc>
@@ -4770,19 +4289,7 @@
               <w:rPr>
                 <w:rFonts w:ascii="Times New Roman" w:hAnsi="Times New Roman" w:cs="Times New Roman"/>
               </w:rPr>
-              <w:t xml:space="preserve">Jumat, </w:t>
-            </w:r>
-            <w:r>
-              <w:rPr>
-                <w:rFonts w:ascii="Times New Roman" w:hAnsi="Times New Roman" w:cs="Times New Roman"/>
-              </w:rPr>
-              <w:t>07</w:t>
-            </w:r>
-            <w:r>
-              <w:rPr>
-                <w:rFonts w:ascii="Times New Roman" w:hAnsi="Times New Roman" w:cs="Times New Roman"/>
-              </w:rPr>
-              <w:t xml:space="preserve"> Agustus 2026</w:t>
+              <w:t>Jumat, 07 Agustus 2026</w:t>
             </w:r>
           </w:p>
         </w:tc>
@@ -4817,13 +4324,7 @@
               <w:rPr>
                 <w:rFonts w:ascii="Times New Roman" w:hAnsi="Times New Roman" w:cs="Times New Roman"/>
               </w:rPr>
-              <w:t>Minggu-0</w:t>
-            </w:r>
-            <w:r>
-              <w:rPr>
-                <w:rFonts w:ascii="Times New Roman" w:hAnsi="Times New Roman" w:cs="Times New Roman"/>
-              </w:rPr>
-              <w:t>8</w:t>
+              <w:t>Minggu-08</w:t>
             </w:r>
           </w:p>
         </w:tc>
@@ -4844,19 +4345,7 @@
               <w:rPr>
                 <w:rFonts w:ascii="Times New Roman" w:hAnsi="Times New Roman" w:cs="Times New Roman"/>
               </w:rPr>
-              <w:t xml:space="preserve">Senin, </w:t>
-            </w:r>
-            <w:r>
-              <w:rPr>
-                <w:rFonts w:ascii="Times New Roman" w:hAnsi="Times New Roman" w:cs="Times New Roman"/>
-              </w:rPr>
-              <w:t>08</w:t>
-            </w:r>
-            <w:r>
-              <w:rPr>
-                <w:rFonts w:ascii="Times New Roman" w:hAnsi="Times New Roman" w:cs="Times New Roman"/>
-              </w:rPr>
-              <w:t xml:space="preserve"> Agustus 2026</w:t>
+              <w:t>Senin, 08 Agustus 2026</w:t>
             </w:r>
           </w:p>
         </w:tc>
@@ -4889,19 +4378,7 @@
               <w:rPr>
                 <w:rFonts w:ascii="Times New Roman" w:hAnsi="Times New Roman" w:cs="Times New Roman"/>
               </w:rPr>
-              <w:t xml:space="preserve">Selasa, </w:t>
-            </w:r>
-            <w:r>
-              <w:rPr>
-                <w:rFonts w:ascii="Times New Roman" w:hAnsi="Times New Roman" w:cs="Times New Roman"/>
-              </w:rPr>
-              <w:t>09</w:t>
-            </w:r>
-            <w:r>
-              <w:rPr>
-                <w:rFonts w:ascii="Times New Roman" w:hAnsi="Times New Roman" w:cs="Times New Roman"/>
-              </w:rPr>
-              <w:t xml:space="preserve"> Agustus 2026</w:t>
+              <w:t>Selasa, 09 Agustus 2026</w:t>
             </w:r>
           </w:p>
         </w:tc>
@@ -4934,19 +4411,7 @@
               <w:rPr>
                 <w:rFonts w:ascii="Times New Roman" w:hAnsi="Times New Roman" w:cs="Times New Roman"/>
               </w:rPr>
-              <w:t xml:space="preserve">Rabu, </w:t>
-            </w:r>
-            <w:r>
-              <w:rPr>
-                <w:rFonts w:ascii="Times New Roman" w:hAnsi="Times New Roman" w:cs="Times New Roman"/>
-              </w:rPr>
-              <w:t>10</w:t>
-            </w:r>
-            <w:r>
-              <w:rPr>
-                <w:rFonts w:ascii="Times New Roman" w:hAnsi="Times New Roman" w:cs="Times New Roman"/>
-              </w:rPr>
-              <w:t xml:space="preserve"> Agustus 2026</w:t>
+              <w:t>Rabu, 10 Agustus 2026</w:t>
             </w:r>
           </w:p>
         </w:tc>
@@ -4979,19 +4444,7 @@
               <w:rPr>
                 <w:rFonts w:ascii="Times New Roman" w:hAnsi="Times New Roman" w:cs="Times New Roman"/>
               </w:rPr>
-              <w:t xml:space="preserve">Kamis, </w:t>
-            </w:r>
-            <w:r>
-              <w:rPr>
-                <w:rFonts w:ascii="Times New Roman" w:hAnsi="Times New Roman" w:cs="Times New Roman"/>
-              </w:rPr>
-              <w:t>11</w:t>
-            </w:r>
-            <w:r>
-              <w:rPr>
-                <w:rFonts w:ascii="Times New Roman" w:hAnsi="Times New Roman" w:cs="Times New Roman"/>
-              </w:rPr>
-              <w:t xml:space="preserve"> Agustus 2026</w:t>
+              <w:t>Kamis, 11 Agustus 2026</w:t>
             </w:r>
           </w:p>
         </w:tc>
@@ -5024,19 +4477,7 @@
               <w:rPr>
                 <w:rFonts w:ascii="Times New Roman" w:hAnsi="Times New Roman" w:cs="Times New Roman"/>
               </w:rPr>
-              <w:t xml:space="preserve">Jumat, </w:t>
-            </w:r>
-            <w:r>
-              <w:rPr>
-                <w:rFonts w:ascii="Times New Roman" w:hAnsi="Times New Roman" w:cs="Times New Roman"/>
-              </w:rPr>
-              <w:t>12</w:t>
-            </w:r>
-            <w:r>
-              <w:rPr>
-                <w:rFonts w:ascii="Times New Roman" w:hAnsi="Times New Roman" w:cs="Times New Roman"/>
-              </w:rPr>
-              <w:t xml:space="preserve"> Agustus 2026</w:t>
+              <w:t>Jumat, 12 Agustus 2026</w:t>
             </w:r>
           </w:p>
         </w:tc>
@@ -5316,45 +4757,13 @@
                 <w:i/>
                 <w:iCs/>
               </w:rPr>
-              <w:t>post-test</w:t>
-            </w:r>
-            <w:r>
-              <w:rPr>
-                <w:rFonts w:ascii="Times New Roman" w:hAnsi="Times New Roman" w:cs="Times New Roman"/>
-                <w:i/>
-                <w:iCs/>
-              </w:rPr>
-              <w:t xml:space="preserve"> untuk </w:t>
-            </w:r>
-            <w:r>
-              <w:rPr>
-                <w:rFonts w:ascii="Times New Roman" w:hAnsi="Times New Roman" w:cs="Times New Roman"/>
-              </w:rPr>
-              <w:t xml:space="preserve">memastikan seluruh peserta Kerja Praktik (KP) telah memahami prosedur keselamatan dan langkah yang harus diambil apabila terjadi kondisi darurat. Selanjutnya, peserta KP diperkenalkan kepada mentor dan staf ahli dari pihak LEN yang akan membimbing selama masa KP. Kegiatan </w:t>
-            </w:r>
-            <w:r>
-              <w:rPr>
-                <w:rFonts w:ascii="Times New Roman" w:hAnsi="Times New Roman" w:cs="Times New Roman"/>
-              </w:rPr>
-              <w:t xml:space="preserve">pada </w:t>
-            </w:r>
-            <w:r>
-              <w:rPr>
-                <w:rFonts w:ascii="Times New Roman" w:hAnsi="Times New Roman" w:cs="Times New Roman"/>
-              </w:rPr>
-              <w:t>hari ini ditutup dengan kunjungan ke kantor ICDEC</w:t>
-            </w:r>
-            <w:r>
-              <w:rPr>
-                <w:rFonts w:ascii="Times New Roman" w:hAnsi="Times New Roman" w:cs="Times New Roman"/>
-              </w:rPr>
-              <w:t xml:space="preserve">, </w:t>
-            </w:r>
-            <w:r>
-              <w:rPr>
-                <w:rFonts w:ascii="Times New Roman" w:hAnsi="Times New Roman" w:cs="Times New Roman"/>
-              </w:rPr>
-              <w:t>peserta KP bertemu dengan mentor dari pihak ICDEC dan menerima pemaparan gambaran umum proyek yang akan dikerjakan oleh masing-masing peserta.</w:t>
+              <w:t xml:space="preserve">post-test untuk </w:t>
+            </w:r>
+            <w:r>
+              <w:rPr>
+                <w:rFonts w:ascii="Times New Roman" w:hAnsi="Times New Roman" w:cs="Times New Roman"/>
+              </w:rPr>
+              <w:t>memastikan seluruh peserta Kerja Praktik (KP) telah memahami prosedur keselamatan dan langkah yang harus diambil apabila terjadi kondisi darurat. Selanjutnya, peserta KP diperkenalkan kepada mentor dan staf ahli dari pihak LEN yang akan membimbing selama masa KP. Kegiatan pada hari ini ditutup dengan kunjungan ke kantor ICDEC, peserta KP bertemu dengan mentor dari pihak ICDEC dan menerima pemaparan gambaran umum proyek yang akan dikerjakan oleh masing-masing peserta.</w:t>
             </w:r>
           </w:p>
         </w:tc>
@@ -5413,19 +4822,7 @@
               <w:rPr>
                 <w:rFonts w:ascii="Times New Roman" w:hAnsi="Times New Roman" w:cs="Times New Roman"/>
               </w:rPr>
-              <w:t>Pada hari in</w:t>
-            </w:r>
-            <w:r>
-              <w:rPr>
-                <w:rFonts w:ascii="Times New Roman" w:hAnsi="Times New Roman" w:cs="Times New Roman"/>
-              </w:rPr>
-              <w:t xml:space="preserve">i, diberikan </w:t>
-            </w:r>
-            <w:r>
-              <w:rPr>
-                <w:rFonts w:ascii="Times New Roman" w:hAnsi="Times New Roman" w:cs="Times New Roman"/>
-              </w:rPr>
-              <w:t xml:space="preserve">board STM32U5A9J-DK sebagai perangkat pengembangan utama proyek. Kegiatan dilanjutkan dengan eksplorasi </w:t>
+              <w:t xml:space="preserve">Pada hari ini, diberikan board STM32U5A9J-DK sebagai perangkat pengembangan utama proyek. Kegiatan dilanjutkan dengan eksplorasi </w:t>
             </w:r>
             <w:r>
               <w:rPr>
@@ -5784,25 +5181,7 @@
         <w:rPr>
           <w:rFonts w:cs="Times New Roman"/>
         </w:rPr>
-        <w:t>2.</w:t>
-      </w:r>
-      <w:r>
-        <w:rPr>
-          <w:rFonts w:cs="Times New Roman"/>
-        </w:rPr>
-        <w:t>2</w:t>
-      </w:r>
-      <w:r>
-        <w:rPr>
-          <w:rFonts w:cs="Times New Roman"/>
-        </w:rPr>
-        <w:t xml:space="preserve"> Minggu-0</w:t>
-      </w:r>
-      <w:r>
-        <w:rPr>
-          <w:rFonts w:cs="Times New Roman"/>
-        </w:rPr>
-        <w:t>2</w:t>
+        <w:t>2.2 Minggu-02</w:t>
       </w:r>
       <w:bookmarkEnd w:id="8"/>
     </w:p>
@@ -5818,19 +5197,7 @@
         <w:rPr>
           <w:rFonts w:cs="Times New Roman"/>
         </w:rPr>
-        <w:t>2.</w:t>
-      </w:r>
-      <w:r>
-        <w:rPr>
-          <w:rFonts w:cs="Times New Roman"/>
-        </w:rPr>
-        <w:t>2</w:t>
-      </w:r>
-      <w:r>
-        <w:rPr>
-          <w:rFonts w:cs="Times New Roman"/>
-        </w:rPr>
-        <w:t>.1 Tabel Kegiatan Mingguan</w:t>
+        <w:t>2.2.1 Tabel Kegiatan Mingguan</w:t>
       </w:r>
       <w:bookmarkEnd w:id="9"/>
     </w:p>
@@ -6335,19 +5702,7 @@
         <w:rPr>
           <w:rFonts w:cs="Times New Roman"/>
         </w:rPr>
-        <w:t>2.</w:t>
-      </w:r>
-      <w:r>
-        <w:rPr>
-          <w:rFonts w:cs="Times New Roman"/>
-        </w:rPr>
-        <w:t>2</w:t>
-      </w:r>
-      <w:r>
-        <w:rPr>
-          <w:rFonts w:cs="Times New Roman"/>
-        </w:rPr>
-        <w:t>.2 Hal yang Didapat dan Refleksi Diri</w:t>
+        <w:t>2.2.2 Hal yang Didapat dan Refleksi Diri</w:t>
       </w:r>
       <w:bookmarkEnd w:id="10"/>
     </w:p>
@@ -6385,25 +5740,7 @@
           <w:rFonts w:cs="Times New Roman"/>
         </w:rPr>
         <w:lastRenderedPageBreak/>
-        <w:t>2.</w:t>
-      </w:r>
-      <w:r>
-        <w:rPr>
-          <w:rFonts w:cs="Times New Roman"/>
-        </w:rPr>
-        <w:t>3</w:t>
-      </w:r>
-      <w:r>
-        <w:rPr>
-          <w:rFonts w:cs="Times New Roman"/>
-        </w:rPr>
-        <w:t xml:space="preserve"> Minggu-0</w:t>
-      </w:r>
-      <w:r>
-        <w:rPr>
-          <w:rFonts w:cs="Times New Roman"/>
-        </w:rPr>
-        <w:t>3</w:t>
+        <w:t>2.3 Minggu-03</w:t>
       </w:r>
       <w:bookmarkEnd w:id="11"/>
     </w:p>
@@ -6419,19 +5756,7 @@
         <w:rPr>
           <w:rFonts w:cs="Times New Roman"/>
         </w:rPr>
-        <w:t>2.</w:t>
-      </w:r>
-      <w:r>
-        <w:rPr>
-          <w:rFonts w:cs="Times New Roman"/>
-        </w:rPr>
-        <w:t>3</w:t>
-      </w:r>
-      <w:r>
-        <w:rPr>
-          <w:rFonts w:cs="Times New Roman"/>
-        </w:rPr>
-        <w:t>.1 Tabel Kegiatan Mingguan</w:t>
+        <w:t>2.3.1 Tabel Kegiatan Mingguan</w:t>
       </w:r>
       <w:bookmarkEnd w:id="12"/>
     </w:p>
@@ -6447,19 +5772,7 @@
         <w:rPr>
           <w:rFonts w:cs="Times New Roman"/>
         </w:rPr>
-        <w:t>2.</w:t>
-      </w:r>
-      <w:r>
-        <w:rPr>
-          <w:rFonts w:cs="Times New Roman"/>
-        </w:rPr>
-        <w:t>3</w:t>
-      </w:r>
-      <w:r>
-        <w:rPr>
-          <w:rFonts w:cs="Times New Roman"/>
-        </w:rPr>
-        <w:t>.2 Hal yang Didapat dan Refleksi Diri</w:t>
+        <w:t>2.3.2 Hal yang Didapat dan Refleksi Diri</w:t>
       </w:r>
       <w:bookmarkEnd w:id="13"/>
     </w:p>
@@ -6475,25 +5788,7 @@
         <w:rPr>
           <w:rFonts w:cs="Times New Roman"/>
         </w:rPr>
-        <w:t>2.</w:t>
-      </w:r>
-      <w:r>
-        <w:rPr>
-          <w:rFonts w:cs="Times New Roman"/>
-        </w:rPr>
-        <w:t>4</w:t>
-      </w:r>
-      <w:r>
-        <w:rPr>
-          <w:rFonts w:cs="Times New Roman"/>
-        </w:rPr>
-        <w:t xml:space="preserve"> Minggu-0</w:t>
-      </w:r>
-      <w:r>
-        <w:rPr>
-          <w:rFonts w:cs="Times New Roman"/>
-        </w:rPr>
-        <w:t>4</w:t>
+        <w:t>2.4 Minggu-04</w:t>
       </w:r>
       <w:bookmarkEnd w:id="14"/>
     </w:p>
@@ -6509,19 +5804,7 @@
         <w:rPr>
           <w:rFonts w:cs="Times New Roman"/>
         </w:rPr>
-        <w:t>2.</w:t>
-      </w:r>
-      <w:r>
-        <w:rPr>
-          <w:rFonts w:cs="Times New Roman"/>
-        </w:rPr>
-        <w:t>4</w:t>
-      </w:r>
-      <w:r>
-        <w:rPr>
-          <w:rFonts w:cs="Times New Roman"/>
-        </w:rPr>
-        <w:t>.1 Tabel Kegiatan Mingguan</w:t>
+        <w:t>2.4.1 Tabel Kegiatan Mingguan</w:t>
       </w:r>
       <w:bookmarkEnd w:id="15"/>
     </w:p>
@@ -6537,19 +5820,7 @@
         <w:rPr>
           <w:rFonts w:cs="Times New Roman"/>
         </w:rPr>
-        <w:t>2.</w:t>
-      </w:r>
-      <w:r>
-        <w:rPr>
-          <w:rFonts w:cs="Times New Roman"/>
-        </w:rPr>
-        <w:t>4</w:t>
-      </w:r>
-      <w:r>
-        <w:rPr>
-          <w:rFonts w:cs="Times New Roman"/>
-        </w:rPr>
-        <w:t>.2 Hal yang Didapat dan Refleksi Diri</w:t>
+        <w:t>2.4.2 Hal yang Didapat dan Refleksi Diri</w:t>
       </w:r>
       <w:bookmarkEnd w:id="16"/>
     </w:p>
@@ -6565,25 +5836,7 @@
         <w:rPr>
           <w:rFonts w:cs="Times New Roman"/>
         </w:rPr>
-        <w:t>2.</w:t>
-      </w:r>
-      <w:r>
-        <w:rPr>
-          <w:rFonts w:cs="Times New Roman"/>
-        </w:rPr>
-        <w:t>5</w:t>
-      </w:r>
-      <w:r>
-        <w:rPr>
-          <w:rFonts w:cs="Times New Roman"/>
-        </w:rPr>
-        <w:t xml:space="preserve"> Minggu-0</w:t>
-      </w:r>
-      <w:r>
-        <w:rPr>
-          <w:rFonts w:cs="Times New Roman"/>
-        </w:rPr>
-        <w:t>5</w:t>
+        <w:t>2.5 Minggu-05</w:t>
       </w:r>
       <w:bookmarkEnd w:id="17"/>
     </w:p>
@@ -6599,19 +5852,7 @@
         <w:rPr>
           <w:rFonts w:cs="Times New Roman"/>
         </w:rPr>
-        <w:t>2.</w:t>
-      </w:r>
-      <w:r>
-        <w:rPr>
-          <w:rFonts w:cs="Times New Roman"/>
-        </w:rPr>
-        <w:t>5</w:t>
-      </w:r>
-      <w:r>
-        <w:rPr>
-          <w:rFonts w:cs="Times New Roman"/>
-        </w:rPr>
-        <w:t>.1 Tabel Kegiatan Mingguan</w:t>
+        <w:t>2.5.1 Tabel Kegiatan Mingguan</w:t>
       </w:r>
       <w:bookmarkEnd w:id="18"/>
     </w:p>
@@ -6627,19 +5868,7 @@
         <w:rPr>
           <w:rFonts w:cs="Times New Roman"/>
         </w:rPr>
-        <w:t>2.</w:t>
-      </w:r>
-      <w:r>
-        <w:rPr>
-          <w:rFonts w:cs="Times New Roman"/>
-        </w:rPr>
-        <w:t>5</w:t>
-      </w:r>
-      <w:r>
-        <w:rPr>
-          <w:rFonts w:cs="Times New Roman"/>
-        </w:rPr>
-        <w:t>.2 Hal yang Didapat dan Refleksi Diri</w:t>
+        <w:t>2.5.2 Hal yang Didapat dan Refleksi Diri</w:t>
       </w:r>
       <w:bookmarkEnd w:id="19"/>
     </w:p>
@@ -6655,25 +5884,7 @@
         <w:rPr>
           <w:rFonts w:cs="Times New Roman"/>
         </w:rPr>
-        <w:t>2.</w:t>
-      </w:r>
-      <w:r>
-        <w:rPr>
-          <w:rFonts w:cs="Times New Roman"/>
-        </w:rPr>
-        <w:t>6</w:t>
-      </w:r>
-      <w:r>
-        <w:rPr>
-          <w:rFonts w:cs="Times New Roman"/>
-        </w:rPr>
-        <w:t xml:space="preserve"> Minggu-0</w:t>
-      </w:r>
-      <w:r>
-        <w:rPr>
-          <w:rFonts w:cs="Times New Roman"/>
-        </w:rPr>
-        <w:t>6</w:t>
+        <w:t>2.6 Minggu-06</w:t>
       </w:r>
       <w:bookmarkEnd w:id="20"/>
     </w:p>
@@ -6689,19 +5900,7 @@
         <w:rPr>
           <w:rFonts w:cs="Times New Roman"/>
         </w:rPr>
-        <w:t>2.</w:t>
-      </w:r>
-      <w:r>
-        <w:rPr>
-          <w:rFonts w:cs="Times New Roman"/>
-        </w:rPr>
-        <w:t>6</w:t>
-      </w:r>
-      <w:r>
-        <w:rPr>
-          <w:rFonts w:cs="Times New Roman"/>
-        </w:rPr>
-        <w:t>.1 Tabel Kegiatan Mingguan</w:t>
+        <w:t>2.6.1 Tabel Kegiatan Mingguan</w:t>
       </w:r>
       <w:bookmarkEnd w:id="21"/>
     </w:p>
@@ -6717,19 +5916,7 @@
         <w:rPr>
           <w:rFonts w:cs="Times New Roman"/>
         </w:rPr>
-        <w:t>2.</w:t>
-      </w:r>
-      <w:r>
-        <w:rPr>
-          <w:rFonts w:cs="Times New Roman"/>
-        </w:rPr>
-        <w:t>6</w:t>
-      </w:r>
-      <w:r>
-        <w:rPr>
-          <w:rFonts w:cs="Times New Roman"/>
-        </w:rPr>
-        <w:t>.2 Hal yang Didapat dan Refleksi Diri</w:t>
+        <w:t>2.6.2 Hal yang Didapat dan Refleksi Diri</w:t>
       </w:r>
       <w:bookmarkEnd w:id="22"/>
     </w:p>
@@ -6745,25 +5932,7 @@
         <w:rPr>
           <w:rFonts w:cs="Times New Roman"/>
         </w:rPr>
-        <w:t>2.</w:t>
-      </w:r>
-      <w:r>
-        <w:rPr>
-          <w:rFonts w:cs="Times New Roman"/>
-        </w:rPr>
-        <w:t>7</w:t>
-      </w:r>
-      <w:r>
-        <w:rPr>
-          <w:rFonts w:cs="Times New Roman"/>
-        </w:rPr>
-        <w:t xml:space="preserve"> Minggu-0</w:t>
-      </w:r>
-      <w:r>
-        <w:rPr>
-          <w:rFonts w:cs="Times New Roman"/>
-        </w:rPr>
-        <w:t>7</w:t>
+        <w:t>2.7 Minggu-07</w:t>
       </w:r>
       <w:bookmarkEnd w:id="23"/>
     </w:p>
@@ -6779,19 +5948,7 @@
         <w:rPr>
           <w:rFonts w:cs="Times New Roman"/>
         </w:rPr>
-        <w:t>2.</w:t>
-      </w:r>
-      <w:r>
-        <w:rPr>
-          <w:rFonts w:cs="Times New Roman"/>
-        </w:rPr>
-        <w:t>7</w:t>
-      </w:r>
-      <w:r>
-        <w:rPr>
-          <w:rFonts w:cs="Times New Roman"/>
-        </w:rPr>
-        <w:t>.1 Tabel Kegiatan Mingguan</w:t>
+        <w:t>2.7.1 Tabel Kegiatan Mingguan</w:t>
       </w:r>
       <w:bookmarkEnd w:id="24"/>
     </w:p>
@@ -6807,19 +5964,7 @@
         <w:rPr>
           <w:rFonts w:cs="Times New Roman"/>
         </w:rPr>
-        <w:t>2.</w:t>
-      </w:r>
-      <w:r>
-        <w:rPr>
-          <w:rFonts w:cs="Times New Roman"/>
-        </w:rPr>
-        <w:t>7</w:t>
-      </w:r>
-      <w:r>
-        <w:rPr>
-          <w:rFonts w:cs="Times New Roman"/>
-        </w:rPr>
-        <w:t>.2 Hal yang Didapat dan Refleksi Diri</w:t>
+        <w:t>2.7.2 Hal yang Didapat dan Refleksi Diri</w:t>
       </w:r>
       <w:bookmarkEnd w:id="25"/>
     </w:p>
@@ -6847,13 +5992,7 @@
         <w:rPr>
           <w:rFonts w:cs="Times New Roman"/>
         </w:rPr>
-        <w:t xml:space="preserve"> Minggu-0</w:t>
-      </w:r>
-      <w:r>
-        <w:rPr>
-          <w:rFonts w:cs="Times New Roman"/>
-        </w:rPr>
-        <w:t>8</w:t>
+        <w:t xml:space="preserve"> Minggu-08</w:t>
       </w:r>
       <w:bookmarkEnd w:id="26"/>
     </w:p>
@@ -6869,19 +6008,7 @@
         <w:rPr>
           <w:rFonts w:cs="Times New Roman"/>
         </w:rPr>
-        <w:t>2.</w:t>
-      </w:r>
-      <w:r>
-        <w:rPr>
-          <w:rFonts w:cs="Times New Roman"/>
-        </w:rPr>
-        <w:t>8</w:t>
-      </w:r>
-      <w:r>
-        <w:rPr>
-          <w:rFonts w:cs="Times New Roman"/>
-        </w:rPr>
-        <w:t>.1 Tabel Kegiatan Mingguan</w:t>
+        <w:t>2.8.1 Tabel Kegiatan Mingguan</w:t>
       </w:r>
       <w:bookmarkEnd w:id="27"/>
     </w:p>
@@ -6897,19 +6024,7 @@
         <w:rPr>
           <w:rFonts w:cs="Times New Roman"/>
         </w:rPr>
-        <w:t>2.</w:t>
-      </w:r>
-      <w:r>
-        <w:rPr>
-          <w:rFonts w:cs="Times New Roman"/>
-        </w:rPr>
-        <w:t>8</w:t>
-      </w:r>
-      <w:r>
-        <w:rPr>
-          <w:rFonts w:cs="Times New Roman"/>
-        </w:rPr>
-        <w:t>.2 Hal yang Didapat dan Refleksi Diri</w:t>
+        <w:t>2.8.2 Hal yang Didapat dan Refleksi Diri</w:t>
       </w:r>
       <w:bookmarkEnd w:id="28"/>
     </w:p>
@@ -7804,6 +6919,7 @@
   <w:style w:type="character" w:default="1" w:styleId="DefaultParagraphFont">
     <w:name w:val="Default Paragraph Font"/>
     <w:uiPriority w:val="1"/>
+    <w:semiHidden/>
     <w:unhideWhenUsed/>
   </w:style>
   <w:style w:type="table" w:default="1" w:styleId="TableNormal">

</xml_diff>